<commit_message>
Weekly to monthly correction
</commit_message>
<xml_diff>
--- a/Internship report.docx
+++ b/Internship report.docx
@@ -3078,16 +3078,12 @@
                 <w:b/>
               </w:rPr>
             </w:pPr>
-            <w:proofErr w:type="spellStart"/>
-            <w:proofErr w:type="gramStart"/>
             <w:r>
               <w:rPr>
                 <w:b/>
               </w:rPr>
               <w:t>Mrs.B.MOHANAPRIYA</w:t>
             </w:r>
-            <w:proofErr w:type="spellEnd"/>
-            <w:proofErr w:type="gramEnd"/>
             <w:r>
               <w:rPr>
                 <w:b/>
@@ -5953,7 +5949,13 @@
               <w:rPr>
                 <w:sz w:val="24"/>
               </w:rPr>
-              <w:t>WEEKLY</w:t>
+              <w:t>MONTHL</w:t>
+            </w:r>
+            <w:r>
+              <w:rPr>
+                <w:sz w:val="24"/>
+              </w:rPr>
+              <w:t>Y</w:t>
             </w:r>
             <w:r>
               <w:rPr>
@@ -10678,16 +10680,7 @@
           <w:sz w:val="24"/>
           <w:szCs w:val="24"/>
         </w:rPr>
-        <w:t>Optimizing performance for seamless interaction with real-time data.</w:t>
-      </w:r>
-      <w:r>
-        <w:rPr>
-          <w:b w:val="0"/>
-          <w:bCs w:val="0"/>
-          <w:sz w:val="24"/>
-          <w:szCs w:val="24"/>
-        </w:rPr>
-        <w:t xml:space="preserve"> </w:t>
+        <w:t xml:space="preserve">Optimizing performance for seamless interaction with real-time data. </w:t>
       </w:r>
     </w:p>
     <w:p>
@@ -12318,7 +12311,7 @@
           <w:sz w:val="24"/>
           <w:szCs w:val="24"/>
         </w:rPr>
-        <w:t>WEEK</w:t>
+        <w:t>MONTH</w:t>
       </w:r>
       <w:r>
         <w:rPr>
@@ -13258,13 +13251,7 @@
         <w:jc w:val="both"/>
       </w:pPr>
       <w:r>
-        <w:t xml:space="preserve">My internship at BI3 </w:t>
-      </w:r>
-      <w:r>
-        <w:t>TECHNOLOGIES</w:t>
-      </w:r>
-      <w:r>
-        <w:t xml:space="preserve"> has been a highly enriching and transformative experience, significantly contributing to both my technical growth and professional development. Specializing in data analytics and mobile application development, this internship provided me with a strong understanding of how modern data-driven solutions are designed, developed, and deployed in real-world business environments. Working with cross-platform technologies, I gained hands-on experience in building applications that transform complex data into meaningful insights.</w:t>
+        <w:t>My internship at BI3 TECHNOLOGIES has been a highly enriching and transformative experience, significantly contributing to both my technical growth and professional development. Specializing in data analytics and mobile application development, this internship provided me with a strong understanding of how modern data-driven solutions are designed, developed, and deployed in real-world business environments. Working with cross-platform technologies, I gained hands-on experience in building applications that transform complex data into meaningful insights.</w:t>
       </w:r>
     </w:p>
     <w:p>
@@ -13283,13 +13270,7 @@
         <w:jc w:val="both"/>
       </w:pPr>
       <w:r>
-        <w:t>One of the key highlights of this internship was the development of a real-time analytics mobile application using React Native. Through this project, I learned how to integrate backend data sources with a mobile frontend, handle real-time data updates, and present insights through intuitive dashboards. This experience enhanced my understanding of data visualization, user interface design, and efficient data handling techniques, which are critical in analytics</w:t>
-      </w:r>
-      <w:r>
-        <w:t xml:space="preserve"> </w:t>
-      </w:r>
-      <w:r>
-        <w:t>driven applications.</w:t>
+        <w:t>One of the key highlights of this internship was the development of a real-time analytics mobile application using React Native. Through this project, I learned how to integrate backend data sources with a mobile frontend, handle real-time data updates, and present insights through intuitive dashboards. This experience enhanced my understanding of data visualization, user interface design, and efficient data handling techniques, which are critical in analytics driven applications.</w:t>
       </w:r>
     </w:p>
     <w:p>
@@ -13308,13 +13289,7 @@
         <w:jc w:val="both"/>
       </w:pPr>
       <w:r>
-        <w:t>Additionally, I gained exposure to the complete lifecycle of a data analytics solution</w:t>
-      </w:r>
-      <w:r>
-        <w:t xml:space="preserve"> </w:t>
-      </w:r>
-      <w:r>
-        <w:t>from understanding business requirements and data flow to implementing features and optimizing performance. I worked with APIs, managed asynchronous data operations, and structured applications using modular design principles. This helped me appreciate the importance of scalability, maintainability, and performance in modern software systems.</w:t>
+        <w:t>Additionally, I gained exposure to the complete lifecycle of a data analytics solution from understanding business requirements and data flow to implementing features and optimizing performance. I worked with APIs, managed asynchronous data operations, and structured applications using modular design principles. This helped me appreciate the importance of scalability, maintainability, and performance in modern software systems.</w:t>
       </w:r>
     </w:p>
     <w:p>
@@ -13375,19 +13350,7 @@
         <w:jc w:val="both"/>
       </w:pPr>
       <w:r>
-        <w:t xml:space="preserve">Overall, my internship at BI3 </w:t>
-      </w:r>
-      <w:r>
-        <w:t>TECHNOLOGIES</w:t>
-      </w:r>
-      <w:r>
-        <w:t xml:space="preserve"> has strengthened my interest in data analytics and application development. It enabled me to bridge the gap between theoretical knowledge and practical implementation while equipping me with essential skills in cross-platform development, real-time data processing, and analytics visualization. This experience has built a solid foundation for my future career and has given me the confidence to work on complex, data</w:t>
-      </w:r>
-      <w:r>
-        <w:t xml:space="preserve"> </w:t>
-      </w:r>
-      <w:r>
-        <w:t>driven software solutions in a professional environment.</w:t>
+        <w:t>Overall, my internship at BI3 TECHNOLOGIES has strengthened my interest in data analytics and application development. It enabled me to bridge the gap between theoretical knowledge and practical implementation while equipping me with essential skills in cross-platform development, real-time data processing, and analytics visualization. This experience has built a solid foundation for my future career and has given me the confidence to work on complex, data driven software solutions in a professional environment.</w:t>
       </w:r>
     </w:p>
     <w:sectPr>

</xml_diff>

<commit_message>
Date change to Apr 2026
</commit_message>
<xml_diff>
--- a/Internship report.docx
+++ b/Internship report.docx
@@ -1152,7 +1152,7 @@
           <w:b/>
           <w:sz w:val="28"/>
         </w:rPr>
-        <w:t>MAY</w:t>
+        <w:t>APRIL</w:t>
       </w:r>
       <w:r>
         <w:rPr>
@@ -2312,7 +2312,7 @@
           <w:b/>
           <w:sz w:val="28"/>
         </w:rPr>
-        <w:t>MAY</w:t>
+        <w:t>APRIL</w:t>
       </w:r>
       <w:r>
         <w:rPr>

</xml_diff>